<commit_message>
docs: retake sync and test screenshots after the fix wave
Co-Authored-By: Claude Fable 5.1 <noreply@anthropic.com>
</commit_message>
<xml_diff>
--- a/docs/reports/stage3-web.docx
+++ b/docs/reports/stage3-web.docx
@@ -2955,7 +2955,7 @@
         <w:rPr>
           <w:lang w:val="uk"/>
         </w:rPr>
-        <w:t xml:space="preserve">Клацання на заголовок «Назва» перемикає порядок; сортування виконує та сама функція</w:t>
+        <w:t xml:space="preserve">Кнопка «Назва» на панелі керування перемикає порядок; сортування виконує та сама функція</w:t>
       </w:r>
       <w:r>
         <w:rPr>
@@ -4559,7 +4559,7 @@
         <w:rPr>
           <w:lang w:val="uk"/>
         </w:rPr>
-        <w:t xml:space="preserve">на десктопі: файл лише локально → вивантажується (</w:t>
+        <w:t xml:space="preserve">на десктопі: файл лише локально → надсилається (</w:t>
       </w:r>
       <w:r>
         <w:rPr>
@@ -5179,7 +5179,77 @@
         <w:rPr>
           <w:lang w:val="uk"/>
         </w:rPr>
-        <w:t xml:space="preserve">), зокрема сценарій «пропускає файл, який журнал уже знає, хоча браузер не міг встановити його mtime».</w:t>
+        <w:t xml:space="preserve">), зокрема сценарій «пропускає файл, який журнал уже знає, хоча браузер не міг встановити його mtime». Журнал прив’язаний до папки за її</w:t>
+      </w:r>
+      <w:r>
+        <w:rPr>
+          <w:lang w:val="uk"/>
+        </w:rPr>
+        <w:t xml:space="preserve"> </w:t>
+      </w:r>
+      <w:r>
+        <w:rPr>
+          <w:i/>
+          <w:iCs/>
+          <w:lang w:val="uk"/>
+        </w:rPr>
+        <w:t xml:space="preserve">назвою</w:t>
+      </w:r>
+      <w:r>
+        <w:rPr>
+          <w:lang w:val="uk"/>
+        </w:rPr>
+        <w:t xml:space="preserve"> </w:t>
+      </w:r>
+      <w:r>
+        <w:rPr>
+          <w:lang w:val="uk"/>
+        </w:rPr>
+        <w:t xml:space="preserve">(</w:t>
+      </w:r>
+      <w:r>
+        <w:rPr>
+          <w:rStyle w:val="VerbatimChar"/>
+          <w:lang w:val="uk"/>
+        </w:rPr>
+        <w:t xml:space="preserve">FileSystemDirectoryHandle</w:t>
+      </w:r>
+      <w:r>
+        <w:rPr>
+          <w:lang w:val="uk"/>
+        </w:rPr>
+        <w:t xml:space="preserve"> </w:t>
+      </w:r>
+      <w:r>
+        <w:rPr>
+          <w:lang w:val="uk"/>
+        </w:rPr>
+        <w:t xml:space="preserve">не надає повного шляху), тому дві різні папки з однаковою назвою (наприклад, дві теки</w:t>
+      </w:r>
+      <w:r>
+        <w:rPr>
+          <w:lang w:val="uk"/>
+        </w:rPr>
+        <w:t xml:space="preserve"> </w:t>
+      </w:r>
+      <w:r>
+        <w:rPr>
+          <w:rStyle w:val="VerbatimChar"/>
+          <w:lang w:val="uk"/>
+        </w:rPr>
+        <w:t xml:space="preserve">work</w:t>
+      </w:r>
+      <w:r>
+        <w:rPr>
+          <w:lang w:val="uk"/>
+        </w:rPr>
+        <w:t xml:space="preserve"> </w:t>
+      </w:r>
+      <w:r>
+        <w:rPr>
+          <w:lang w:val="uk"/>
+        </w:rPr>
+        <w:t xml:space="preserve">в різних місцях диска) поділяють один журнал — це прийняте обмеження веб-версії, не варте обходу через окреме сховище ідентифікаторів для навчального проєкту.</w:t>
       </w:r>
     </w:p>
     <w:p>
@@ -5296,7 +5366,7 @@
         <w:rPr>
           <w:lang w:val="uk"/>
         </w:rPr>
-        <w:t xml:space="preserve">На знімку нижче до синхронізації прив’язана порожня (з погляду сервера) папка з двома новими локальними файлами; на сервері вже лежало шість файлів із розділу «Веб-клієнт» вище. Звіт після синхронізації — реальні числа з живого API: «Завантажено 2, вивантажено 6, пропущено 0, помилок 0» (два нових локальних файли вивантажено на сервер, шість серверних файлів довантажено в щойно прив’язану папку).</w:t>
+        <w:t xml:space="preserve">На знімку нижче до синхронізації прив’язана порожня (з погляду сервера) папка з двома новими локальними файлами; на сервері вже лежало шість файлів із розділу «Веб-клієнт» вище. Звіт після синхронізації — реальні числа з живого API: «Надіслано 2, скачано 6, пропущено 0, помилок 0» (два нових локальних файли надіслано на сервер, шість файлів сервера скачано в папку).</w:t>
       </w:r>
     </w:p>
     <w:p>
@@ -5467,7 +5537,7 @@
               <w:rPr>
                 <w:lang w:val="uk"/>
               </w:rPr>
-              <w:t xml:space="preserve">на пам’ятевій фейковій директорії: одночасне вивантаження локального-лише файлу й довантаження віддаленого-лише файлу з фіксацією обох у журналі; пропуск файлу, який журнал уже знає, попри неможливість браузера встановити mtime; підрахунок помилок без переривання решти передавань і звіт про прогрес (</w:t>
+              <w:t xml:space="preserve">на пам’ятевій фейковій директорії: одночасне надсилання локального-лише файлу й скачування віддаленого-лише файлу з фіксацією обох у журналі; пропуск файлу, який журнал уже знає, попри неможливість браузера встановити mtime; підрахунок помилок без переривання решти передавань і звіт про прогрес (</w:t>
             </w:r>
             <w:r>
               <w:rPr>
@@ -5481,6 +5551,76 @@
                 <w:lang w:val="uk"/>
               </w:rPr>
               <w:t xml:space="preserve">)</w:t>
+            </w:r>
+          </w:p>
+        </w:tc>
+        <w:tc>
+          <w:tcPr/>
+          <w:p>
+            <w:pPr>
+              <w:pStyle w:val="Compact"/>
+            </w:pPr>
+            <w:r>
+              <w:rPr>
+                <w:lang w:val="uk"/>
+              </w:rPr>
+              <w:t xml:space="preserve">4</w:t>
+            </w:r>
+          </w:p>
+        </w:tc>
+      </w:tr>
+      <w:tr>
+        <w:tc>
+          <w:tcPr/>
+          <w:p>
+            <w:pPr>
+              <w:pStyle w:val="Compact"/>
+            </w:pPr>
+            <w:r>
+              <w:rPr>
+                <w:rStyle w:val="VerbatimChar"/>
+                <w:lang w:val="uk"/>
+              </w:rPr>
+              <w:t xml:space="preserve">packages/shared/src/sync.test.ts</w:t>
+            </w:r>
+            <w:r>
+              <w:rPr>
+                <w:lang w:val="uk"/>
+              </w:rPr>
+              <w:t xml:space="preserve"> </w:t>
+            </w:r>
+            <w:r>
+              <w:rPr>
+                <w:lang w:val="uk"/>
+              </w:rPr>
+              <w:t xml:space="preserve">(нові випадки)</w:t>
+            </w:r>
+          </w:p>
+        </w:tc>
+        <w:tc>
+          <w:tcPr/>
+          <w:p>
+            <w:pPr>
+              <w:pStyle w:val="Compact"/>
+            </w:pPr>
+            <w:r>
+              <w:rPr>
+                <w:rStyle w:val="VerbatimChar"/>
+                <w:lang w:val="uk"/>
+              </w:rPr>
+              <w:t xml:space="preserve">runSyncPlan</w:t>
+            </w:r>
+            <w:r>
+              <w:rPr>
+                <w:lang w:val="uk"/>
+              </w:rPr>
+              <w:t xml:space="preserve"> </w:t>
+            </w:r>
+            <w:r>
+              <w:rPr>
+                <w:lang w:val="uk"/>
+              </w:rPr>
+              <w:t xml:space="preserve">— спільний цикл виконання плану для обох клієнтів: підрахунок надісланих/скачаних/пропущених файлів, фіксація помилки без переривання решти передавань, повідомлення про прогрес, зникнення віддаленого запису як помилка</w:t>
             </w:r>
           </w:p>
         </w:tc>
@@ -5635,7 +5775,7 @@
         <w:rPr>
           <w:lang w:val="uk"/>
         </w:rPr>
-        <w:t xml:space="preserve">Ці два файли — приріст етапу 3 до набору тестів, успадкованого від етапу 2 (</w:t>
+        <w:t xml:space="preserve">Ці три групи тестів — приріст етапу 3 до набору тестів, успадкованого від етапу 2 (</w:t>
       </w:r>
       <w:r>
         <w:rPr>
@@ -5775,7 +5915,7 @@
           <w:bCs/>
           <w:lang w:val="uk"/>
         </w:rPr>
-        <w:t xml:space="preserve">shared — 47</w:t>
+        <w:t xml:space="preserve">shared — 51</w:t>
       </w:r>
       <w:r>
         <w:rPr>
@@ -5855,19 +5995,19 @@
           <w:bCs/>
           <w:lang w:val="uk"/>
         </w:rPr>
-        <w:t xml:space="preserve">81</w:t>
-      </w:r>
-      <w:r>
-        <w:rPr>
-          <w:lang w:val="uk"/>
-        </w:rPr>
-        <w:t xml:space="preserve"> </w:t>
-      </w:r>
-      <w:r>
-        <w:rPr>
-          <w:lang w:val="uk"/>
-        </w:rPr>
-        <w:t xml:space="preserve">тест, усі проходять (</w:t>
+        <w:t xml:space="preserve">85</w:t>
+      </w:r>
+      <w:r>
+        <w:rPr>
+          <w:lang w:val="uk"/>
+        </w:rPr>
+        <w:t xml:space="preserve"> </w:t>
+      </w:r>
+      <w:r>
+        <w:rPr>
+          <w:lang w:val="uk"/>
+        </w:rPr>
+        <w:t xml:space="preserve">тестів, усі проходять (</w:t>
       </w:r>
       <w:r>
         <w:rPr>
@@ -5898,7 +6038,7 @@
           <wp:inline>
             <wp:extent cx="5334000" cy="4586242"/>
             <wp:effectExtent b="0" l="0" r="0" t="0"/>
-            <wp:docPr descr="Термінал з результатом yarn test: 81 тест пройдено (shared 47, api 23, desktop 7, web 4)" title="" id="60" name="Picture"/>
+            <wp:docPr descr="Термінал з результатом yarn test: 85 тестів пройдено (shared 51, api 23, desktop 7, web 4)" title="" id="60" name="Picture"/>
             <a:graphic>
               <a:graphicData uri="http://schemas.openxmlformats.org/drawingml/2006/picture">
                 <pic:pic>
@@ -6641,6 +6781,95 @@
           <w:lang w:val="uk"/>
         </w:rPr>
         <w:t xml:space="preserve">», тобто веб-клієнт у production-збірці звертається до API через той самий домен і проксі, без порту 3000.</w:t>
+      </w:r>
+      <w:r>
+        <w:rPr>
+          <w:lang w:val="uk"/>
+        </w:rPr>
+        <w:t xml:space="preserve"> </w:t>
+      </w:r>
+      <w:r>
+        <w:rPr>
+          <w:rStyle w:val="VerbatimChar"/>
+          <w:lang w:val="uk"/>
+        </w:rPr>
+        <w:t xml:space="preserve">CORS_ORIGINS</w:t>
+      </w:r>
+      <w:r>
+        <w:rPr>
+          <w:lang w:val="uk"/>
+        </w:rPr>
+        <w:t xml:space="preserve"> </w:t>
+      </w:r>
+      <w:r>
+        <w:rPr>
+          <w:lang w:val="uk"/>
+        </w:rPr>
+        <w:t xml:space="preserve">у production дозволяє будь-яке джерело (</w:t>
+      </w:r>
+      <w:r>
+        <w:rPr>
+          <w:rStyle w:val="VerbatimChar"/>
+          <w:lang w:val="uk"/>
+        </w:rPr>
+        <w:t xml:space="preserve">*</w:t>
+      </w:r>
+      <w:r>
+        <w:rPr>
+          <w:lang w:val="uk"/>
+        </w:rPr>
+        <w:t xml:space="preserve">): десктоп-клієнт вантажиться з локального файла (</w:t>
+      </w:r>
+      <w:r>
+        <w:rPr>
+          <w:rStyle w:val="VerbatimChar"/>
+          <w:lang w:val="uk"/>
+        </w:rPr>
+        <w:t xml:space="preserve">win.loadFile</w:t>
+      </w:r>
+      <w:r>
+        <w:rPr>
+          <w:lang w:val="uk"/>
+        </w:rPr>
+        <w:t xml:space="preserve">), тому Chromium надсилає</w:t>
+      </w:r>
+      <w:r>
+        <w:rPr>
+          <w:lang w:val="uk"/>
+        </w:rPr>
+        <w:t xml:space="preserve"> </w:t>
+      </w:r>
+      <w:r>
+        <w:rPr>
+          <w:rStyle w:val="VerbatimChar"/>
+          <w:lang w:val="uk"/>
+        </w:rPr>
+        <w:t xml:space="preserve">Origin: null</w:t>
+      </w:r>
+      <w:r>
+        <w:rPr>
+          <w:lang w:val="uk"/>
+        </w:rPr>
+        <w:t xml:space="preserve">, який неможливо перелічити явно, а API автентифікує запити виключно</w:t>
+      </w:r>
+      <w:r>
+        <w:rPr>
+          <w:lang w:val="uk"/>
+        </w:rPr>
+        <w:t xml:space="preserve"> </w:t>
+      </w:r>
+      <w:r>
+        <w:rPr>
+          <w:rStyle w:val="VerbatimChar"/>
+          <w:lang w:val="uk"/>
+        </w:rPr>
+        <w:t xml:space="preserve">Bearer</w:t>
+      </w:r>
+      <w:r>
+        <w:rPr>
+          <w:lang w:val="uk"/>
+        </w:rPr>
+        <w:t xml:space="preserve">-токеном без cookie, тож дозвіл довільного джерела не відкриває нічого, чого зловмисник не потребував би вже викраденого токена.</w:t>
       </w:r>
     </w:p>
     <w:p>
@@ -7754,7 +7983,7 @@
         <w:rPr>
           <w:lang w:val="uk"/>
         </w:rPr>
-        <w:t xml:space="preserve">покрито 10 новими unit-тестами (shared +6, web +4); разом із успадкованими від етапу 2 —</w:t>
+        <w:t xml:space="preserve">покрито 14 новими unit-тестами (shared +10, web +4); разом із успадкованими від етапу 2 —</w:t>
       </w:r>
       <w:r>
         <w:rPr>
@@ -7768,7 +7997,7 @@
           <w:bCs/>
           <w:lang w:val="uk"/>
         </w:rPr>
-        <w:t xml:space="preserve">81 тест, усі проходять</w:t>
+        <w:t xml:space="preserve">85 тестів, усі проходять</w:t>
       </w:r>
       <w:r>
         <w:rPr>

</xml_diff>

<commit_message>
docs: separate .cpp and .png filters in diagrams, reports and screenshots
Co-Authored-By: Claude Fable 5.1 <noreply@anthropic.com>
</commit_message>
<xml_diff>
--- a/docs/reports/stage3-web.docx
+++ b/docs/reports/stage3-web.docx
@@ -159,7 +159,7 @@
         <w:rPr>
           <w:lang w:val="uk"/>
         </w:rPr>
-        <w:t xml:space="preserve">,</w:t>
+        <w:t xml:space="preserve">» / «лише</w:t>
       </w:r>
       <w:r>
         <w:rPr>
@@ -3125,7 +3125,7 @@
         <w:rPr>
           <w:lang w:val="uk"/>
         </w:rPr>
-        <w:t xml:space="preserve">,</w:t>
+        <w:t xml:space="preserve">» / «Лише</w:t>
       </w:r>
       <w:r>
         <w:rPr>
@@ -3156,7 +3156,7 @@
           <wp:inline>
             <wp:extent cx="5334000" cy="3429000"/>
             <wp:effectExtent b="0" l="0" r="0" t="0"/>
-            <wp:docPr descr="Фільтр «Лише .cpp, .png»: залишились logo.png і main.cpp" title="" id="31" name="Picture"/>
+            <wp:docPr descr="Фільтр «Лише .png»: залишився logo.png" title="" id="31" name="Picture"/>
             <a:graphic>
               <a:graphicData uri="http://schemas.openxmlformats.org/drawingml/2006/picture">
                 <pic:pic>

</xml_diff>

<commit_message>
docs(uml): align diagrams with the implementation
Co-Authored-By: Claude Fable 5.1 <noreply@anthropic.com>
</commit_message>
<xml_diff>
--- a/docs/reports/stage3-web.docx
+++ b/docs/reports/stage3-web.docx
@@ -1746,7 +1746,7 @@
       <w:r>
         <w:drawing>
           <wp:inline>
-            <wp:extent cx="5334000" cy="3579560"/>
+            <wp:extent cx="5334000" cy="3664012"/>
             <wp:effectExtent b="0" l="0" r="0" t="0"/>
             <wp:docPr descr="Діаграма класів спільного пакета і клієнтів (оновлено для етапу 3)" title="" id="11" name="Picture"/>
             <a:graphic>
@@ -1767,7 +1767,7 @@
                   <pic:spPr bwMode="auto">
                     <a:xfrm>
                       <a:off x="0" y="0"/>
-                      <a:ext cx="5334000" cy="3579560"/>
+                      <a:ext cx="5334000" cy="3664012"/>
                     </a:xfrm>
                     <a:prstGeom prst="rect">
                       <a:avLst/>
@@ -1793,7 +1793,7 @@
       <w:r>
         <w:drawing>
           <wp:inline>
-            <wp:extent cx="5334000" cy="3136478"/>
+            <wp:extent cx="5334000" cy="2946177"/>
             <wp:effectExtent b="0" l="0" r="0" t="0"/>
             <wp:docPr descr="Діаграма компонентів" title="" id="14" name="Picture"/>
             <a:graphic>
@@ -1814,7 +1814,7 @@
                   <pic:spPr bwMode="auto">
                     <a:xfrm>
                       <a:off x="0" y="0"/>
-                      <a:ext cx="5334000" cy="3136478"/>
+                      <a:ext cx="5334000" cy="2946177"/>
                     </a:xfrm>
                     <a:prstGeom prst="rect">
                       <a:avLst/>

</xml_diff>

<commit_message>
docs: department title page and numbered figure captions in all reports
Co-Authored-By: Claude Fable 5.1 <noreply@anthropic.com>
</commit_message>
<xml_diff>
--- a/docs/reports/stage3-web.docx
+++ b/docs/reports/stage3-web.docx
@@ -15,70 +15,24 @@
     </w:p>
     <w:p>
       <w:pPr>
-        <w:pStyle w:val="Subtitle"/>
-      </w:pPr>
-      <w:r>
-        <w:rPr>
-          <w:lang w:val="uk"/>
-        </w:rPr>
-        <w:t xml:space="preserve">Веб-орієнтована версія (Next.js) та розгортання</w:t>
+        <w:pStyle w:val="Author"/>
+      </w:pPr>
+      <w:r>
+        <w:rPr>
+          <w:lang w:val="uk"/>
+        </w:rPr>
+        <w:t xml:space="preserve">Студента четвертого курсу групи МІ-41 факультету комп’ютерних наук та кібернетики Петрова Богдана Вікторовича</w:t>
       </w:r>
     </w:p>
     <w:p>
       <w:pPr>
-        <w:pStyle w:val="Author"/>
-      </w:pPr>
-      <w:r>
-        <w:rPr>
-          <w:lang w:val="uk"/>
-        </w:rPr>
-        <w:t xml:space="preserve">Виконав: студент групи МІ-41 Петров Богдан</w:t>
-      </w:r>
-    </w:p>
-    <w:p>
-      <w:pPr>
-        <w:pStyle w:val="Author"/>
-      </w:pPr>
-      <w:r>
-        <w:rPr>
-          <w:lang w:val="uk"/>
-        </w:rPr>
-        <w:t xml:space="preserve">Перевірив: ________________</w:t>
-      </w:r>
-    </w:p>
-    <w:p>
-      <w:pPr>
         <w:pStyle w:val="Date"/>
       </w:pPr>
       <w:r>
         <w:rPr>
           <w:lang w:val="uk"/>
         </w:rPr>
-        <w:t xml:space="preserve">Київський національний університет імені Тараса Шевченка</w:t>
-      </w:r>
-      <w:r>
-        <w:rPr>
-          <w:lang w:val="uk"/>
-        </w:rPr>
-        <w:t xml:space="preserve"> </w:t>
-      </w:r>
-      <w:r>
-        <w:rPr>
-          <w:lang w:val="uk"/>
-        </w:rPr>
-        <w:t xml:space="preserve">Дисципліна «Інформаційні технології»</w:t>
-      </w:r>
-      <w:r>
-        <w:rPr>
-          <w:lang w:val="uk"/>
-        </w:rPr>
-        <w:t xml:space="preserve"> </w:t>
-      </w:r>
-      <w:r>
-        <w:rPr>
-          <w:lang w:val="uk"/>
-        </w:rPr>
-        <w:t xml:space="preserve">Київ — 2026</w:t>
+        <w:t xml:space="preserve">Київ-2026</w:t>
       </w:r>
     </w:p>
     <w:sdt>
@@ -1741,7 +1695,7 @@
     </w:p>
     <w:p>
       <w:pPr>
-        <w:pStyle w:val="BodyText"/>
+        <w:pStyle w:val="CaptionedFigure"/>
       </w:pPr>
       <w:r>
         <w:drawing>
@@ -1788,7 +1742,18 @@
     </w:p>
     <w:p>
       <w:pPr>
-        <w:pStyle w:val="BodyText"/>
+        <w:pStyle w:val="ImageCaption"/>
+      </w:pPr>
+      <w:r>
+        <w:rPr>
+          <w:lang w:val="uk"/>
+        </w:rPr>
+        <w:t xml:space="preserve">Діаграма класів спільного пакета і клієнтів (оновлено для етапу 3)</w:t>
+      </w:r>
+    </w:p>
+    <w:p>
+      <w:pPr>
+        <w:pStyle w:val="CaptionedFigure"/>
       </w:pPr>
       <w:r>
         <w:drawing>
@@ -1833,6 +1798,17 @@
         </w:drawing>
       </w:r>
     </w:p>
+    <w:p>
+      <w:pPr>
+        <w:pStyle w:val="ImageCaption"/>
+      </w:pPr>
+      <w:r>
+        <w:rPr>
+          <w:lang w:val="uk"/>
+        </w:rPr>
+        <w:t xml:space="preserve">Діаграма компонентів</w:t>
+      </w:r>
+    </w:p>
     <w:bookmarkEnd w:id="16"/>
     <w:bookmarkStart w:id="17" w:name="технології"/>
     <w:p>
@@ -2722,7 +2698,7 @@
     </w:p>
     <w:p>
       <w:pPr>
-        <w:pStyle w:val="BodyText"/>
+        <w:pStyle w:val="CaptionedFigure"/>
       </w:pPr>
       <w:r>
         <w:drawing>
@@ -2767,6 +2743,17 @@
         </w:drawing>
       </w:r>
     </w:p>
+    <w:p>
+      <w:pPr>
+        <w:pStyle w:val="ImageCaption"/>
+      </w:pPr>
+      <w:r>
+        <w:rPr>
+          <w:lang w:val="uk"/>
+        </w:rPr>
+        <w:t xml:space="preserve">Сторінка входу з рядком адреси сервера</w:t>
+      </w:r>
+    </w:p>
     <w:bookmarkEnd w:id="21"/>
     <w:bookmarkStart w:id="25" w:name="таблиця-файлів-і-атрибути"/>
     <w:p>
@@ -2879,7 +2866,7 @@
     </w:p>
     <w:p>
       <w:pPr>
-        <w:pStyle w:val="BodyText"/>
+        <w:pStyle w:val="CaptionedFigure"/>
       </w:pPr>
       <w:r>
         <w:drawing>
@@ -2924,6 +2911,17 @@
         </w:drawing>
       </w:r>
     </w:p>
+    <w:p>
+      <w:pPr>
+        <w:pStyle w:val="ImageCaption"/>
+      </w:pPr>
+      <w:r>
+        <w:rPr>
+          <w:lang w:val="uk"/>
+        </w:rPr>
+        <w:t xml:space="preserve">Таблиця з усіма стовпцями, сортування за зростанням</w:t>
+      </w:r>
+    </w:p>
     <w:bookmarkEnd w:id="25"/>
     <w:bookmarkStart w:id="29" w:name="сортування-за-назвою-операція-варіанта"/>
     <w:p>
@@ -3017,7 +3015,7 @@
     </w:p>
     <w:p>
       <w:pPr>
-        <w:pStyle w:val="BodyText"/>
+        <w:pStyle w:val="CaptionedFigure"/>
       </w:pPr>
       <w:r>
         <w:drawing>
@@ -3062,6 +3060,17 @@
         </w:drawing>
       </w:r>
     </w:p>
+    <w:p>
+      <w:pPr>
+        <w:pStyle w:val="ImageCaption"/>
+      </w:pPr>
+      <w:r>
+        <w:rPr>
+          <w:lang w:val="uk"/>
+        </w:rPr>
+        <w:t xml:space="preserve">Сортування за спаданням</w:t>
+      </w:r>
+    </w:p>
     <w:bookmarkEnd w:id="29"/>
     <w:bookmarkStart w:id="33" w:name="фільтр-за-типом-операція-варіанта"/>
     <w:p>
@@ -3149,7 +3158,7 @@
     </w:p>
     <w:p>
       <w:pPr>
-        <w:pStyle w:val="BodyText"/>
+        <w:pStyle w:val="CaptionedFigure"/>
       </w:pPr>
       <w:r>
         <w:drawing>
@@ -3194,6 +3203,17 @@
         </w:drawing>
       </w:r>
     </w:p>
+    <w:p>
+      <w:pPr>
+        <w:pStyle w:val="ImageCaption"/>
+      </w:pPr>
+      <w:r>
+        <w:rPr>
+          <w:lang w:val="uk"/>
+        </w:rPr>
+        <w:t xml:space="preserve">Фільтр «Лише .png»: залишився logo.png</w:t>
+      </w:r>
+    </w:p>
     <w:bookmarkEnd w:id="33"/>
     <w:bookmarkStart w:id="37" w:name="показприховування-стовпців"/>
     <w:p>
@@ -3262,7 +3282,7 @@
     </w:p>
     <w:p>
       <w:pPr>
-        <w:pStyle w:val="BodyText"/>
+        <w:pStyle w:val="CaptionedFigure"/>
       </w:pPr>
       <w:r>
         <w:drawing>
@@ -3307,6 +3327,17 @@
         </w:drawing>
       </w:r>
     </w:p>
+    <w:p>
+      <w:pPr>
+        <w:pStyle w:val="ImageCaption"/>
+      </w:pPr>
+      <w:r>
+        <w:rPr>
+          <w:lang w:val="uk"/>
+        </w:rPr>
+        <w:t xml:space="preserve">П’ять стовпців приховано, «Назва» лишається видимою</w:t>
+      </w:r>
+    </w:p>
     <w:bookmarkEnd w:id="37"/>
     <w:bookmarkStart w:id="44" w:name="X59933ce8778aa8472d72b0f41bcd30c835e36f0"/>
     <w:p>
@@ -3570,7 +3601,7 @@
     </w:p>
     <w:p>
       <w:pPr>
-        <w:pStyle w:val="BodyText"/>
+        <w:pStyle w:val="CaptionedFigure"/>
       </w:pPr>
       <w:r>
         <w:drawing>
@@ -3617,7 +3648,43 @@
     </w:p>
     <w:p>
       <w:pPr>
-        <w:pStyle w:val="BodyText"/>
+        <w:pStyle w:val="ImageCaption"/>
+      </w:pPr>
+      <w:r>
+        <w:rPr>
+          <w:lang w:val="uk"/>
+        </w:rPr>
+        <w:t xml:space="preserve">Перегляд</w:t>
+      </w:r>
+      <w:r>
+        <w:rPr>
+          <w:lang w:val="uk"/>
+        </w:rPr>
+        <w:t xml:space="preserve"> </w:t>
+      </w:r>
+      <w:r>
+        <w:rPr>
+          <w:rStyle w:val="VerbatimChar"/>
+          <w:lang w:val="uk"/>
+        </w:rPr>
+        <w:t xml:space="preserve">.cs</w:t>
+      </w:r>
+      <w:r>
+        <w:rPr>
+          <w:lang w:val="uk"/>
+        </w:rPr>
+        <w:t xml:space="preserve"> </w:t>
+      </w:r>
+      <w:r>
+        <w:rPr>
+          <w:lang w:val="uk"/>
+        </w:rPr>
+        <w:t xml:space="preserve">як тексту</w:t>
+      </w:r>
+    </w:p>
+    <w:p>
+      <w:pPr>
+        <w:pStyle w:val="CaptionedFigure"/>
       </w:pPr>
       <w:r>
         <w:drawing>
@@ -3662,6 +3729,42 @@
         </w:drawing>
       </w:r>
     </w:p>
+    <w:p>
+      <w:pPr>
+        <w:pStyle w:val="ImageCaption"/>
+      </w:pPr>
+      <w:r>
+        <w:rPr>
+          <w:lang w:val="uk"/>
+        </w:rPr>
+        <w:t xml:space="preserve">Перегляд</w:t>
+      </w:r>
+      <w:r>
+        <w:rPr>
+          <w:lang w:val="uk"/>
+        </w:rPr>
+        <w:t xml:space="preserve"> </w:t>
+      </w:r>
+      <w:r>
+        <w:rPr>
+          <w:rStyle w:val="VerbatimChar"/>
+          <w:lang w:val="uk"/>
+        </w:rPr>
+        <w:t xml:space="preserve">.jpg</w:t>
+      </w:r>
+      <w:r>
+        <w:rPr>
+          <w:lang w:val="uk"/>
+        </w:rPr>
+        <w:t xml:space="preserve"> </w:t>
+      </w:r>
+      <w:r>
+        <w:rPr>
+          <w:lang w:val="uk"/>
+        </w:rPr>
+        <w:t xml:space="preserve">як зображення</w:t>
+      </w:r>
+    </w:p>
     <w:bookmarkEnd w:id="44"/>
     <w:bookmarkStart w:id="48" w:name="Xcc567c9a5eb4869c59ae6ff94bdb1a1f0d6df8d"/>
     <w:p>
@@ -3793,7 +3896,7 @@
     </w:p>
     <w:p>
       <w:pPr>
-        <w:pStyle w:val="BodyText"/>
+        <w:pStyle w:val="CaptionedFigure"/>
       </w:pPr>
       <w:r>
         <w:drawing>
@@ -3838,6 +3941,17 @@
         </w:drawing>
       </w:r>
     </w:p>
+    <w:p>
+      <w:pPr>
+        <w:pStyle w:val="ImageCaption"/>
+      </w:pPr>
+      <w:r>
+        <w:rPr>
+          <w:lang w:val="uk"/>
+        </w:rPr>
+        <w:t xml:space="preserve">Підказка під час перетягування файлів у вікно браузера</w:t>
+      </w:r>
+    </w:p>
     <w:bookmarkEnd w:id="48"/>
     <w:bookmarkStart w:id="52" w:name="скачування"/>
     <w:p>
@@ -4056,7 +4170,7 @@
     </w:p>
     <w:p>
       <w:pPr>
-        <w:pStyle w:val="BodyText"/>
+        <w:pStyle w:val="CaptionedFigure"/>
       </w:pPr>
       <w:r>
         <w:drawing>
@@ -4101,6 +4215,17 @@
         </w:drawing>
       </w:r>
     </w:p>
+    <w:p>
+      <w:pPr>
+        <w:pStyle w:val="ImageCaption"/>
+      </w:pPr>
+      <w:r>
+        <w:rPr>
+          <w:lang w:val="uk"/>
+        </w:rPr>
+        <w:t xml:space="preserve">Файл обрано, кнопка «Скачати» у натиснутому стані</w:t>
+      </w:r>
+    </w:p>
     <w:bookmarkEnd w:id="52"/>
     <w:bookmarkStart w:id="53" w:name="видалення"/>
     <w:p>
@@ -5371,7 +5496,7 @@
     </w:p>
     <w:p>
       <w:pPr>
-        <w:pStyle w:val="BodyText"/>
+        <w:pStyle w:val="CaptionedFigure"/>
       </w:pPr>
       <w:r>
         <w:drawing>
@@ -5414,6 +5539,17 @@
             </a:graphic>
           </wp:inline>
         </w:drawing>
+      </w:r>
+    </w:p>
+    <w:p>
+      <w:pPr>
+        <w:pStyle w:val="ImageCaption"/>
+      </w:pPr>
+      <w:r>
+        <w:rPr>
+          <w:lang w:val="uk"/>
+        </w:rPr>
+        <w:t xml:space="preserve">Панель синхронізації після натискання «Синхронізувати»</w:t>
       </w:r>
     </w:p>
     <w:bookmarkEnd w:id="58"/>
@@ -6031,7 +6167,7 @@
     </w:p>
     <w:p>
       <w:pPr>
-        <w:pStyle w:val="BodyText"/>
+        <w:pStyle w:val="CaptionedFigure"/>
       </w:pPr>
       <w:r>
         <w:drawing>
@@ -6076,6 +6212,36 @@
         </w:drawing>
       </w:r>
     </w:p>
+    <w:p>
+      <w:pPr>
+        <w:pStyle w:val="ImageCaption"/>
+      </w:pPr>
+      <w:r>
+        <w:rPr>
+          <w:lang w:val="uk"/>
+        </w:rPr>
+        <w:t xml:space="preserve">Термінал з результатом</w:t>
+      </w:r>
+      <w:r>
+        <w:rPr>
+          <w:lang w:val="uk"/>
+        </w:rPr>
+        <w:t xml:space="preserve"> </w:t>
+      </w:r>
+      <w:r>
+        <w:rPr>
+          <w:rStyle w:val="VerbatimChar"/>
+          <w:lang w:val="uk"/>
+        </w:rPr>
+        <w:t xml:space="preserve">yarn test</w:t>
+      </w:r>
+      <w:r>
+        <w:rPr>
+          <w:lang w:val="uk"/>
+        </w:rPr>
+        <w:t xml:space="preserve">: 85 тестів пройдено (shared 51, api 23, desktop 7, web 4)</w:t>
+      </w:r>
+    </w:p>
     <w:bookmarkEnd w:id="62"/>
     <w:bookmarkStart w:id="68" w:name="розгортання"/>
     <w:p>
@@ -6874,7 +7040,7 @@
     </w:p>
     <w:p>
       <w:pPr>
-        <w:pStyle w:val="BodyText"/>
+        <w:pStyle w:val="CaptionedFigure"/>
       </w:pPr>
       <w:r>
         <w:drawing>
@@ -6917,6 +7083,30 @@
             </a:graphic>
           </wp:inline>
         </w:drawing>
+      </w:r>
+    </w:p>
+    <w:p>
+      <w:pPr>
+        <w:pStyle w:val="ImageCaption"/>
+      </w:pPr>
+      <w:r>
+        <w:rPr>
+          <w:lang w:val="uk"/>
+        </w:rPr>
+        <w:t xml:space="preserve">Сторінка входу production-збірки (</w:t>
+      </w:r>
+      <w:r>
+        <w:rPr>
+          <w:rStyle w:val="VerbatimChar"/>
+          <w:lang w:val="uk"/>
+        </w:rPr>
+        <w:t xml:space="preserve">https://localhost/login</w:t>
+      </w:r>
+      <w:r>
+        <w:rPr>
+          <w:lang w:val="uk"/>
+        </w:rPr>
+        <w:t xml:space="preserve">)</w:t>
       </w:r>
     </w:p>
     <w:p>

</xml_diff>

<commit_message>
docs: keep table columns within the page in the pdf reports
Co-Authored-By: Claude Fable 5.1 <noreply@anthropic.com>
</commit_message>
<xml_diff>
--- a/docs/reports/stage3-web.docx
+++ b/docs/reports/stage3-web.docx
@@ -5575,6 +5575,105 @@
         <w:t xml:space="preserve">Тестування</w:t>
       </w:r>
     </w:p>
+    <w:p>
+      <w:pPr>
+        <w:pStyle w:val="FirstParagraph"/>
+      </w:pPr>
+      <w:r>
+        <w:rPr>
+          <w:lang w:val="uk"/>
+        </w:rPr>
+        <w:t xml:space="preserve">Файли тестів подано як «робочий простір / файл»:</w:t>
+      </w:r>
+      <w:r>
+        <w:rPr>
+          <w:lang w:val="uk"/>
+        </w:rPr>
+        <w:t xml:space="preserve"> </w:t>
+      </w:r>
+      <w:r>
+        <w:rPr>
+          <w:rStyle w:val="VerbatimChar"/>
+          <w:lang w:val="uk"/>
+        </w:rPr>
+        <w:t xml:space="preserve">web</w:t>
+      </w:r>
+      <w:r>
+        <w:rPr>
+          <w:lang w:val="uk"/>
+        </w:rPr>
+        <w:t xml:space="preserve"> </w:t>
+      </w:r>
+      <w:r>
+        <w:rPr>
+          <w:lang w:val="uk"/>
+        </w:rPr>
+        <w:t xml:space="preserve">—</w:t>
+      </w:r>
+      <w:r>
+        <w:rPr>
+          <w:lang w:val="uk"/>
+        </w:rPr>
+        <w:t xml:space="preserve"> </w:t>
+      </w:r>
+      <w:r>
+        <w:rPr>
+          <w:rStyle w:val="VerbatimChar"/>
+          <w:lang w:val="uk"/>
+        </w:rPr>
+        <w:t xml:space="preserve">apps/web/src/lib</w:t>
+      </w:r>
+      <w:r>
+        <w:rPr>
+          <w:lang w:val="uk"/>
+        </w:rPr>
+        <w:t xml:space="preserve">,</w:t>
+      </w:r>
+      <w:r>
+        <w:rPr>
+          <w:lang w:val="uk"/>
+        </w:rPr>
+        <w:t xml:space="preserve"> </w:t>
+      </w:r>
+      <w:r>
+        <w:rPr>
+          <w:rStyle w:val="VerbatimChar"/>
+          <w:lang w:val="uk"/>
+        </w:rPr>
+        <w:t xml:space="preserve">shared</w:t>
+      </w:r>
+      <w:r>
+        <w:rPr>
+          <w:lang w:val="uk"/>
+        </w:rPr>
+        <w:t xml:space="preserve"> </w:t>
+      </w:r>
+      <w:r>
+        <w:rPr>
+          <w:lang w:val="uk"/>
+        </w:rPr>
+        <w:t xml:space="preserve">—</w:t>
+      </w:r>
+      <w:r>
+        <w:rPr>
+          <w:lang w:val="uk"/>
+        </w:rPr>
+        <w:t xml:space="preserve"> </w:t>
+      </w:r>
+      <w:r>
+        <w:rPr>
+          <w:rStyle w:val="VerbatimChar"/>
+          <w:lang w:val="uk"/>
+        </w:rPr>
+        <w:t xml:space="preserve">packages/shared/src</w:t>
+      </w:r>
+      <w:r>
+        <w:rPr>
+          <w:lang w:val="uk"/>
+        </w:rPr>
+        <w:t xml:space="preserve">.</w:t>
+      </w:r>
+    </w:p>
     <w:tbl>
       <w:tblPr>
         <w:tblStyle w:val="Table"/>
@@ -5583,9 +5682,9 @@
         <w:tblLook w:firstRow="1" w:lastRow="0" w:firstColumn="0" w:lastColumn="0" w:noHBand="0" w:noVBand="0" w:val="0020"/>
       </w:tblPr>
       <w:tblGrid>
-        <w:gridCol w:w="2640"/>
-        <w:gridCol w:w="2640"/>
-        <w:gridCol w:w="2640"/>
+        <w:gridCol w:w="2747"/>
+        <w:gridCol w:w="4525"/>
+        <w:gridCol w:w="646"/>
       </w:tblGrid>
       <w:tr>
         <w:trPr>
@@ -5643,10 +5742,22 @@
             </w:pPr>
             <w:r>
               <w:rPr>
+                <w:lang w:val="uk"/>
+              </w:rPr>
+              <w:t xml:space="preserve">web /</w:t>
+            </w:r>
+            <w:r>
+              <w:rPr>
+                <w:lang w:val="uk"/>
+              </w:rPr>
+              <w:t xml:space="preserve"> </w:t>
+            </w:r>
+            <w:r>
+              <w:rPr>
                 <w:rStyle w:val="VerbatimChar"/>
                 <w:lang w:val="uk"/>
               </w:rPr>
-              <w:t xml:space="preserve">apps/web/src/lib/browserSync.test.ts</w:t>
+              <w:t xml:space="preserve">browserSync.test.ts</w:t>
             </w:r>
           </w:p>
         </w:tc>
@@ -5714,10 +5825,22 @@
             </w:pPr>
             <w:r>
               <w:rPr>
+                <w:lang w:val="uk"/>
+              </w:rPr>
+              <w:t xml:space="preserve">shared /</w:t>
+            </w:r>
+            <w:r>
+              <w:rPr>
+                <w:lang w:val="uk"/>
+              </w:rPr>
+              <w:t xml:space="preserve"> </w:t>
+            </w:r>
+            <w:r>
+              <w:rPr>
                 <w:rStyle w:val="VerbatimChar"/>
                 <w:lang w:val="uk"/>
               </w:rPr>
-              <w:t xml:space="preserve">packages/shared/src/sync.test.ts</w:t>
+              <w:t xml:space="preserve">sync.test.ts</w:t>
             </w:r>
             <w:r>
               <w:rPr>
@@ -5784,10 +5907,22 @@
             </w:pPr>
             <w:r>
               <w:rPr>
+                <w:lang w:val="uk"/>
+              </w:rPr>
+              <w:t xml:space="preserve">shared /</w:t>
+            </w:r>
+            <w:r>
+              <w:rPr>
+                <w:lang w:val="uk"/>
+              </w:rPr>
+              <w:t xml:space="preserve"> </w:t>
+            </w:r>
+            <w:r>
+              <w:rPr>
                 <w:rStyle w:val="VerbatimChar"/>
                 <w:lang w:val="uk"/>
               </w:rPr>
-              <w:t xml:space="preserve">packages/shared/src/syncLedger.test.ts</w:t>
+              <w:t xml:space="preserve">syncLedger.test.ts</w:t>
             </w:r>
           </w:p>
         </w:tc>

</xml_diff>

<commit_message>
docs: add the repository link to the stage 2 and 3 reports
Co-Authored-By: Claude Fable 5.1 <noreply@anthropic.com>
</commit_message>
<xml_diff>
--- a/docs/reports/stage3-web.docx
+++ b/docs/reports/stage3-web.docx
@@ -64,7 +64,7 @@
         </w:p>
       </w:sdtContent>
     </w:sdt>
-    <w:bookmarkStart w:id="9" w:name="постановка-задачі-етапу-3"/>
+    <w:bookmarkStart w:id="10" w:name="постановка-задачі-етапу-3"/>
     <w:p>
       <w:pPr>
         <w:pStyle w:val="Heading1"/>
@@ -92,6 +92,34 @@
       </w:pPr>
       <w:r>
         <w:rPr>
+          <w:b/>
+          <w:bCs/>
+          <w:lang w:val="uk"/>
+        </w:rPr>
+        <w:t xml:space="preserve">Посилання на GitHub:</w:t>
+      </w:r>
+      <w:r>
+        <w:rPr>
+          <w:lang w:val="uk"/>
+        </w:rPr>
+        <w:t xml:space="preserve"> </w:t>
+      </w:r>
+      <w:hyperlink r:id="rId9">
+        <w:r>
+          <w:rPr>
+            <w:rStyle w:val="Hyperlink"/>
+            <w:lang w:val="uk"/>
+          </w:rPr>
+          <w:t xml:space="preserve">https://github.com/AIAvenger1/minidrive</w:t>
+        </w:r>
+      </w:hyperlink>
+    </w:p>
+    <w:p>
+      <w:pPr>
+        <w:pStyle w:val="BodyText"/>
+      </w:pPr>
+      <w:r>
+        <w:rPr>
           <w:lang w:val="uk"/>
         </w:rPr>
         <w:t xml:space="preserve">Завдання етапу 3 — реалізувати веб-орієнтовану версію клієнта MiniDrive для варіанта 4-6 поверх того самого сервера (NestJS, REST-контракт без змін), не дублюючи логіку, вже реалізовану на етапі 2: реєстрацію та вхід, перегляд файлів власного простору з атрибутами, сортування за назвою (операція варіанта), фільтр «лише</w:t>
@@ -185,8 +213,8 @@
         <w:t xml:space="preserve">як зображення (типи варіанта), завантаження (кнопкою і drag-and-drop), скачування, видалення та синхронізацію локальної папки з віддаленим простором — вимоги R1–R9 із специфікації етапу 1. Оскільки браузер не має прямого доступу до файлової системи так, як настільний застосунок, синхронізація реалізована через File System Access API з узгодженим відхиленням від правил §4.2 (журнал синхронізації замість встановлення mtime — див. розділ 5). Бонусним завданням етапу є підготовка серверної частини та веб-клієнта до публікації в інтернеті (production-розгортання за HTTPS).</w:t>
       </w:r>
     </w:p>
-    <w:bookmarkEnd w:id="9"/>
-    <w:bookmarkStart w:id="16" w:name="архітектура"/>
+    <w:bookmarkEnd w:id="10"/>
+    <w:bookmarkStart w:id="17" w:name="архітектура"/>
     <w:p>
       <w:pPr>
         <w:pStyle w:val="Heading1"/>
@@ -1702,18 +1730,18 @@
           <wp:inline>
             <wp:extent cx="5334000" cy="3664012"/>
             <wp:effectExtent b="0" l="0" r="0" t="0"/>
-            <wp:docPr descr="Діаграма класів спільного пакета і клієнтів (оновлено для етапу 3)" title="" id="11" name="Picture"/>
+            <wp:docPr descr="Діаграма класів спільного пакета і клієнтів (оновлено для етапу 3)" title="" id="12" name="Picture"/>
             <a:graphic>
               <a:graphicData uri="http://schemas.openxmlformats.org/drawingml/2006/picture">
                 <pic:pic>
                   <pic:nvPicPr>
-                    <pic:cNvPr descr="../uml/img/05-class-clients.png" id="12" name="Picture"/>
+                    <pic:cNvPr descr="../uml/img/05-class-clients.png" id="13" name="Picture"/>
                     <pic:cNvPicPr>
                       <a:picLocks noChangeArrowheads="1" noChangeAspect="1"/>
                     </pic:cNvPicPr>
                   </pic:nvPicPr>
                   <pic:blipFill>
-                    <a:blip r:embed="rId10"/>
+                    <a:blip r:embed="rId11"/>
                     <a:stretch>
                       <a:fillRect/>
                     </a:stretch>
@@ -1760,18 +1788,18 @@
           <wp:inline>
             <wp:extent cx="5334000" cy="2946177"/>
             <wp:effectExtent b="0" l="0" r="0" t="0"/>
-            <wp:docPr descr="Діаграма компонентів" title="" id="14" name="Picture"/>
+            <wp:docPr descr="Діаграма компонентів" title="" id="15" name="Picture"/>
             <a:graphic>
               <a:graphicData uri="http://schemas.openxmlformats.org/drawingml/2006/picture">
                 <pic:pic>
                   <pic:nvPicPr>
-                    <pic:cNvPr descr="../uml/img/15-component.png" id="15" name="Picture"/>
+                    <pic:cNvPr descr="../uml/img/15-component.png" id="16" name="Picture"/>
                     <pic:cNvPicPr>
                       <a:picLocks noChangeArrowheads="1" noChangeAspect="1"/>
                     </pic:cNvPicPr>
                   </pic:nvPicPr>
                   <pic:blipFill>
-                    <a:blip r:embed="rId13"/>
+                    <a:blip r:embed="rId14"/>
                     <a:stretch>
                       <a:fillRect/>
                     </a:stretch>
@@ -1809,8 +1837,8 @@
         <w:t xml:space="preserve">Діаграма компонентів</w:t>
       </w:r>
     </w:p>
-    <w:bookmarkEnd w:id="16"/>
-    <w:bookmarkStart w:id="17" w:name="технології"/>
+    <w:bookmarkEnd w:id="17"/>
+    <w:bookmarkStart w:id="18" w:name="технології"/>
     <w:p>
       <w:pPr>
         <w:pStyle w:val="Heading1"/>
@@ -2389,8 +2417,8 @@
         <w:t xml:space="preserve">, як у десктоп-клієнта, — це єдина суттєва відмінність у зберіганні стану між клієнтами, зумовлена середовищем виконання (браузер проти Node-процесу).</w:t>
       </w:r>
     </w:p>
-    <w:bookmarkEnd w:id="17"/>
-    <w:bookmarkStart w:id="54" w:name="веб-клієнт"/>
+    <w:bookmarkEnd w:id="18"/>
+    <w:bookmarkStart w:id="55" w:name="веб-клієнт"/>
     <w:p>
       <w:pPr>
         <w:pStyle w:val="Heading1"/>
@@ -2594,7 +2622,7 @@
         <w:t xml:space="preserve">з іншим вмістом (щоб «Змінено» відрізнялося від «Створено»); після зйомки тестові файли видалено з сервера.</w:t>
       </w:r>
     </w:p>
-    <w:bookmarkStart w:id="21" w:name="вхід"/>
+    <w:bookmarkStart w:id="22" w:name="вхід"/>
     <w:p>
       <w:pPr>
         <w:pStyle w:val="Heading2"/>
@@ -2705,18 +2733,18 @@
           <wp:inline>
             <wp:extent cx="3959999" cy="2545714"/>
             <wp:effectExtent b="0" l="0" r="0" t="0"/>
-            <wp:docPr descr="Сторінка входу з рядком адреси сервера" title="" id="19" name="Picture"/>
+            <wp:docPr descr="Сторінка входу з рядком адреси сервера" title="" id="20" name="Picture"/>
             <a:graphic>
               <a:graphicData uri="http://schemas.openxmlformats.org/drawingml/2006/picture">
                 <pic:pic>
                   <pic:nvPicPr>
-                    <pic:cNvPr descr="img/web-01-login.png" id="20" name="Picture"/>
+                    <pic:cNvPr descr="img/web-01-login.png" id="21" name="Picture"/>
                     <pic:cNvPicPr>
                       <a:picLocks noChangeArrowheads="1" noChangeAspect="1"/>
                     </pic:cNvPicPr>
                   </pic:nvPicPr>
                   <pic:blipFill>
-                    <a:blip r:embed="rId18"/>
+                    <a:blip r:embed="rId19"/>
                     <a:stretch>
                       <a:fillRect/>
                     </a:stretch>
@@ -2754,8 +2782,8 @@
         <w:t xml:space="preserve">Сторінка входу з рядком адреси сервера</w:t>
       </w:r>
     </w:p>
-    <w:bookmarkEnd w:id="21"/>
-    <w:bookmarkStart w:id="25" w:name="таблиця-файлів-і-атрибути"/>
+    <w:bookmarkEnd w:id="22"/>
+    <w:bookmarkStart w:id="26" w:name="таблиця-файлів-і-атрибути"/>
     <w:p>
       <w:pPr>
         <w:pStyle w:val="Heading2"/>
@@ -2873,18 +2901,18 @@
           <wp:inline>
             <wp:extent cx="5334000" cy="3429000"/>
             <wp:effectExtent b="0" l="0" r="0" t="0"/>
-            <wp:docPr descr="Таблиця з усіма стовпцями, сортування за зростанням" title="" id="23" name="Picture"/>
+            <wp:docPr descr="Таблиця з усіма стовпцями, сортування за зростанням" title="" id="24" name="Picture"/>
             <a:graphic>
               <a:graphicData uri="http://schemas.openxmlformats.org/drawingml/2006/picture">
                 <pic:pic>
                   <pic:nvPicPr>
-                    <pic:cNvPr descr="img/web-02-table.png" id="24" name="Picture"/>
+                    <pic:cNvPr descr="img/web-02-table.png" id="25" name="Picture"/>
                     <pic:cNvPicPr>
                       <a:picLocks noChangeArrowheads="1" noChangeAspect="1"/>
                     </pic:cNvPicPr>
                   </pic:nvPicPr>
                   <pic:blipFill>
-                    <a:blip r:embed="rId22"/>
+                    <a:blip r:embed="rId23"/>
                     <a:stretch>
                       <a:fillRect/>
                     </a:stretch>
@@ -2922,8 +2950,8 @@
         <w:t xml:space="preserve">Таблиця з усіма стовпцями, сортування за зростанням</w:t>
       </w:r>
     </w:p>
-    <w:bookmarkEnd w:id="25"/>
-    <w:bookmarkStart w:id="29" w:name="сортування-за-назвою-операція-варіанта"/>
+    <w:bookmarkEnd w:id="26"/>
+    <w:bookmarkStart w:id="30" w:name="сортування-за-назвою-операція-варіанта"/>
     <w:p>
       <w:pPr>
         <w:pStyle w:val="Heading2"/>
@@ -3022,18 +3050,18 @@
           <wp:inline>
             <wp:extent cx="5334000" cy="3429000"/>
             <wp:effectExtent b="0" l="0" r="0" t="0"/>
-            <wp:docPr descr="Сортування за спаданням" title="" id="27" name="Picture"/>
+            <wp:docPr descr="Сортування за спаданням" title="" id="28" name="Picture"/>
             <a:graphic>
               <a:graphicData uri="http://schemas.openxmlformats.org/drawingml/2006/picture">
                 <pic:pic>
                   <pic:nvPicPr>
-                    <pic:cNvPr descr="img/web-03-sort-desc.png" id="28" name="Picture"/>
+                    <pic:cNvPr descr="img/web-03-sort-desc.png" id="29" name="Picture"/>
                     <pic:cNvPicPr>
                       <a:picLocks noChangeArrowheads="1" noChangeAspect="1"/>
                     </pic:cNvPicPr>
                   </pic:nvPicPr>
                   <pic:blipFill>
-                    <a:blip r:embed="rId26"/>
+                    <a:blip r:embed="rId27"/>
                     <a:stretch>
                       <a:fillRect/>
                     </a:stretch>
@@ -3071,8 +3099,8 @@
         <w:t xml:space="preserve">Сортування за спаданням</w:t>
       </w:r>
     </w:p>
-    <w:bookmarkEnd w:id="29"/>
-    <w:bookmarkStart w:id="33" w:name="фільтр-за-типом-операція-варіанта"/>
+    <w:bookmarkEnd w:id="30"/>
+    <w:bookmarkStart w:id="34" w:name="фільтр-за-типом-операція-варіанта"/>
     <w:p>
       <w:pPr>
         <w:pStyle w:val="Heading2"/>
@@ -3165,18 +3193,18 @@
           <wp:inline>
             <wp:extent cx="5334000" cy="3429000"/>
             <wp:effectExtent b="0" l="0" r="0" t="0"/>
-            <wp:docPr descr="Фільтр «Лише .png»: залишився logo.png" title="" id="31" name="Picture"/>
+            <wp:docPr descr="Фільтр «Лише .png»: залишився logo.png" title="" id="32" name="Picture"/>
             <a:graphic>
               <a:graphicData uri="http://schemas.openxmlformats.org/drawingml/2006/picture">
                 <pic:pic>
                   <pic:nvPicPr>
-                    <pic:cNvPr descr="img/web-04-filter.png" id="32" name="Picture"/>
+                    <pic:cNvPr descr="img/web-04-filter.png" id="33" name="Picture"/>
                     <pic:cNvPicPr>
                       <a:picLocks noChangeArrowheads="1" noChangeAspect="1"/>
                     </pic:cNvPicPr>
                   </pic:nvPicPr>
                   <pic:blipFill>
-                    <a:blip r:embed="rId30"/>
+                    <a:blip r:embed="rId31"/>
                     <a:stretch>
                       <a:fillRect/>
                     </a:stretch>
@@ -3214,8 +3242,8 @@
         <w:t xml:space="preserve">Фільтр «Лише .png»: залишився logo.png</w:t>
       </w:r>
     </w:p>
-    <w:bookmarkEnd w:id="33"/>
-    <w:bookmarkStart w:id="37" w:name="показприховування-стовпців"/>
+    <w:bookmarkEnd w:id="34"/>
+    <w:bookmarkStart w:id="38" w:name="показприховування-стовпців"/>
     <w:p>
       <w:pPr>
         <w:pStyle w:val="Heading2"/>
@@ -3289,18 +3317,18 @@
           <wp:inline>
             <wp:extent cx="5334000" cy="3429000"/>
             <wp:effectExtent b="0" l="0" r="0" t="0"/>
-            <wp:docPr descr="П’ять стовпців приховано, «Назва» лишається видимою" title="" id="35" name="Picture"/>
+            <wp:docPr descr="П’ять стовпців приховано, «Назва» лишається видимою" title="" id="36" name="Picture"/>
             <a:graphic>
               <a:graphicData uri="http://schemas.openxmlformats.org/drawingml/2006/picture">
                 <pic:pic>
                   <pic:nvPicPr>
-                    <pic:cNvPr descr="img/web-05-columns.png" id="36" name="Picture"/>
+                    <pic:cNvPr descr="img/web-05-columns.png" id="37" name="Picture"/>
                     <pic:cNvPicPr>
                       <a:picLocks noChangeArrowheads="1" noChangeAspect="1"/>
                     </pic:cNvPicPr>
                   </pic:nvPicPr>
                   <pic:blipFill>
-                    <a:blip r:embed="rId34"/>
+                    <a:blip r:embed="rId35"/>
                     <a:stretch>
                       <a:fillRect/>
                     </a:stretch>
@@ -3338,8 +3366,8 @@
         <w:t xml:space="preserve">П’ять стовпців приховано, «Назва» лишається видимою</w:t>
       </w:r>
     </w:p>
-    <w:bookmarkEnd w:id="37"/>
-    <w:bookmarkStart w:id="44" w:name="X59933ce8778aa8472d72b0f41bcd30c835e36f0"/>
+    <w:bookmarkEnd w:id="38"/>
+    <w:bookmarkStart w:id="45" w:name="X59933ce8778aa8472d72b0f41bcd30c835e36f0"/>
     <w:p>
       <w:pPr>
         <w:pStyle w:val="Heading2"/>
@@ -3608,18 +3636,18 @@
           <wp:inline>
             <wp:extent cx="5334000" cy="3429000"/>
             <wp:effectExtent b="0" l="0" r="0" t="0"/>
-            <wp:docPr descr="Перегляд .cs як тексту" title="" id="39" name="Picture"/>
+            <wp:docPr descr="Перегляд .cs як тексту" title="" id="40" name="Picture"/>
             <a:graphic>
               <a:graphicData uri="http://schemas.openxmlformats.org/drawingml/2006/picture">
                 <pic:pic>
                   <pic:nvPicPr>
-                    <pic:cNvPr descr="img/web-06-preview-cs.png" id="40" name="Picture"/>
+                    <pic:cNvPr descr="img/web-06-preview-cs.png" id="41" name="Picture"/>
                     <pic:cNvPicPr>
                       <a:picLocks noChangeArrowheads="1" noChangeAspect="1"/>
                     </pic:cNvPicPr>
                   </pic:nvPicPr>
                   <pic:blipFill>
-                    <a:blip r:embed="rId38"/>
+                    <a:blip r:embed="rId39"/>
                     <a:stretch>
                       <a:fillRect/>
                     </a:stretch>
@@ -3691,18 +3719,18 @@
           <wp:inline>
             <wp:extent cx="5334000" cy="3429000"/>
             <wp:effectExtent b="0" l="0" r="0" t="0"/>
-            <wp:docPr descr="Перегляд .jpg як зображення" title="" id="42" name="Picture"/>
+            <wp:docPr descr="Перегляд .jpg як зображення" title="" id="43" name="Picture"/>
             <a:graphic>
               <a:graphicData uri="http://schemas.openxmlformats.org/drawingml/2006/picture">
                 <pic:pic>
                   <pic:nvPicPr>
-                    <pic:cNvPr descr="img/web-07-preview-jpg.png" id="43" name="Picture"/>
+                    <pic:cNvPr descr="img/web-07-preview-jpg.png" id="44" name="Picture"/>
                     <pic:cNvPicPr>
                       <a:picLocks noChangeArrowheads="1" noChangeAspect="1"/>
                     </pic:cNvPicPr>
                   </pic:nvPicPr>
                   <pic:blipFill>
-                    <a:blip r:embed="rId41"/>
+                    <a:blip r:embed="rId42"/>
                     <a:stretch>
                       <a:fillRect/>
                     </a:stretch>
@@ -3765,8 +3793,8 @@
         <w:t xml:space="preserve">як зображення</w:t>
       </w:r>
     </w:p>
-    <w:bookmarkEnd w:id="44"/>
-    <w:bookmarkStart w:id="48" w:name="Xcc567c9a5eb4869c59ae6ff94bdb1a1f0d6df8d"/>
+    <w:bookmarkEnd w:id="45"/>
+    <w:bookmarkStart w:id="49" w:name="Xcc567c9a5eb4869c59ae6ff94bdb1a1f0d6df8d"/>
     <w:p>
       <w:pPr>
         <w:pStyle w:val="Heading2"/>
@@ -3903,18 +3931,18 @@
           <wp:inline>
             <wp:extent cx="5334000" cy="3429000"/>
             <wp:effectExtent b="0" l="0" r="0" t="0"/>
-            <wp:docPr descr="Підказка під час перетягування файлів у вікно браузера" title="" id="46" name="Picture"/>
+            <wp:docPr descr="Підказка під час перетягування файлів у вікно браузера" title="" id="47" name="Picture"/>
             <a:graphic>
               <a:graphicData uri="http://schemas.openxmlformats.org/drawingml/2006/picture">
                 <pic:pic>
                   <pic:nvPicPr>
-                    <pic:cNvPr descr="img/web-08-dragdrop.png" id="47" name="Picture"/>
+                    <pic:cNvPr descr="img/web-08-dragdrop.png" id="48" name="Picture"/>
                     <pic:cNvPicPr>
                       <a:picLocks noChangeArrowheads="1" noChangeAspect="1"/>
                     </pic:cNvPicPr>
                   </pic:nvPicPr>
                   <pic:blipFill>
-                    <a:blip r:embed="rId45"/>
+                    <a:blip r:embed="rId46"/>
                     <a:stretch>
                       <a:fillRect/>
                     </a:stretch>
@@ -3952,8 +3980,8 @@
         <w:t xml:space="preserve">Підказка під час перетягування файлів у вікно браузера</w:t>
       </w:r>
     </w:p>
-    <w:bookmarkEnd w:id="48"/>
-    <w:bookmarkStart w:id="52" w:name="скачування"/>
+    <w:bookmarkEnd w:id="49"/>
+    <w:bookmarkStart w:id="53" w:name="скачування"/>
     <w:p>
       <w:pPr>
         <w:pStyle w:val="Heading2"/>
@@ -4177,18 +4205,18 @@
           <wp:inline>
             <wp:extent cx="5334000" cy="3429000"/>
             <wp:effectExtent b="0" l="0" r="0" t="0"/>
-            <wp:docPr descr="Файл обрано, кнопка «Скачати» у натиснутому стані" title="" id="50" name="Picture"/>
+            <wp:docPr descr="Файл обрано, кнопка «Скачати» у натиснутому стані" title="" id="51" name="Picture"/>
             <a:graphic>
               <a:graphicData uri="http://schemas.openxmlformats.org/drawingml/2006/picture">
                 <pic:pic>
                   <pic:nvPicPr>
-                    <pic:cNvPr descr="img/web-09-download.png" id="51" name="Picture"/>
+                    <pic:cNvPr descr="img/web-09-download.png" id="52" name="Picture"/>
                     <pic:cNvPicPr>
                       <a:picLocks noChangeArrowheads="1" noChangeAspect="1"/>
                     </pic:cNvPicPr>
                   </pic:nvPicPr>
                   <pic:blipFill>
-                    <a:blip r:embed="rId49"/>
+                    <a:blip r:embed="rId50"/>
                     <a:stretch>
                       <a:fillRect/>
                     </a:stretch>
@@ -4226,8 +4254,8 @@
         <w:t xml:space="preserve">Файл обрано, кнопка «Скачати» у натиснутому стані</w:t>
       </w:r>
     </w:p>
-    <w:bookmarkEnd w:id="52"/>
-    <w:bookmarkStart w:id="53" w:name="видалення"/>
+    <w:bookmarkEnd w:id="53"/>
+    <w:bookmarkStart w:id="54" w:name="видалення"/>
     <w:p>
       <w:pPr>
         <w:pStyle w:val="Heading2"/>
@@ -4330,9 +4358,9 @@
         <w:t xml:space="preserve">.</w:t>
       </w:r>
     </w:p>
-    <w:bookmarkEnd w:id="53"/>
     <w:bookmarkEnd w:id="54"/>
-    <w:bookmarkStart w:id="58" w:name="синхронізація-папки-в-браузері"/>
+    <w:bookmarkEnd w:id="55"/>
+    <w:bookmarkStart w:id="59" w:name="синхронізація-папки-в-браузері"/>
     <w:p>
       <w:pPr>
         <w:pStyle w:val="Heading1"/>
@@ -5503,18 +5531,18 @@
           <wp:inline>
             <wp:extent cx="5334000" cy="3429000"/>
             <wp:effectExtent b="0" l="0" r="0" t="0"/>
-            <wp:docPr descr="Панель синхронізації після натискання «Синхронізувати»" title="" id="56" name="Picture"/>
+            <wp:docPr descr="Панель синхронізації після натискання «Синхронізувати»" title="" id="57" name="Picture"/>
             <a:graphic>
               <a:graphicData uri="http://schemas.openxmlformats.org/drawingml/2006/picture">
                 <pic:pic>
                   <pic:nvPicPr>
-                    <pic:cNvPr descr="img/web-10-sync.png" id="57" name="Picture"/>
+                    <pic:cNvPr descr="img/web-10-sync.png" id="58" name="Picture"/>
                     <pic:cNvPicPr>
                       <a:picLocks noChangeArrowheads="1" noChangeAspect="1"/>
                     </pic:cNvPicPr>
                   </pic:nvPicPr>
                   <pic:blipFill>
-                    <a:blip r:embed="rId55"/>
+                    <a:blip r:embed="rId56"/>
                     <a:stretch>
                       <a:fillRect/>
                     </a:stretch>
@@ -5552,8 +5580,8 @@
         <w:t xml:space="preserve">Панель синхронізації після натискання «Синхронізувати»</w:t>
       </w:r>
     </w:p>
-    <w:bookmarkEnd w:id="58"/>
-    <w:bookmarkStart w:id="62" w:name="тестування"/>
+    <w:bookmarkEnd w:id="59"/>
+    <w:bookmarkStart w:id="63" w:name="тестування"/>
     <w:p>
       <w:pPr>
         <w:pStyle w:val="Heading1"/>
@@ -6309,18 +6337,18 @@
           <wp:inline>
             <wp:extent cx="5334000" cy="4586242"/>
             <wp:effectExtent b="0" l="0" r="0" t="0"/>
-            <wp:docPr descr="Термінал з результатом yarn test: 85 тестів пройдено (shared 51, api 23, desktop 7, web 4)" title="" id="60" name="Picture"/>
+            <wp:docPr descr="Термінал з результатом yarn test: 85 тестів пройдено (shared 51, api 23, desktop 7, web 4)" title="" id="61" name="Picture"/>
             <a:graphic>
               <a:graphicData uri="http://schemas.openxmlformats.org/drawingml/2006/picture">
                 <pic:pic>
                   <pic:nvPicPr>
-                    <pic:cNvPr descr="img/web-11-tests.png" id="61" name="Picture"/>
+                    <pic:cNvPr descr="img/web-11-tests.png" id="62" name="Picture"/>
                     <pic:cNvPicPr>
                       <a:picLocks noChangeArrowheads="1" noChangeAspect="1"/>
                     </pic:cNvPicPr>
                   </pic:nvPicPr>
                   <pic:blipFill>
-                    <a:blip r:embed="rId59"/>
+                    <a:blip r:embed="rId60"/>
                     <a:stretch>
                       <a:fillRect/>
                     </a:stretch>
@@ -6377,8 +6405,8 @@
         <w:t xml:space="preserve">: 85 тестів пройдено (shared 51, api 23, desktop 7, web 4)</w:t>
       </w:r>
     </w:p>
-    <w:bookmarkEnd w:id="62"/>
-    <w:bookmarkStart w:id="68" w:name="розгортання"/>
+    <w:bookmarkEnd w:id="63"/>
+    <w:bookmarkStart w:id="69" w:name="розгортання"/>
     <w:p>
       <w:pPr>
         <w:pStyle w:val="Heading1"/>
@@ -6400,7 +6428,7 @@
         <w:t xml:space="preserve">Розгортання</w:t>
       </w:r>
     </w:p>
-    <w:bookmarkStart w:id="63" w:name="розробницький-стек"/>
+    <w:bookmarkStart w:id="64" w:name="розробницький-стек"/>
     <w:p>
       <w:pPr>
         <w:pStyle w:val="Heading2"/>
@@ -6591,8 +6619,8 @@
         <w:t xml:space="preserve">.</w:t>
       </w:r>
     </w:p>
-    <w:bookmarkEnd w:id="63"/>
-    <w:bookmarkStart w:id="67" w:name="production-стек"/>
+    <w:bookmarkEnd w:id="64"/>
+    <w:bookmarkStart w:id="68" w:name="production-стек"/>
     <w:p>
       <w:pPr>
         <w:pStyle w:val="Heading2"/>
@@ -7182,18 +7210,18 @@
           <wp:inline>
             <wp:extent cx="3959999" cy="2545714"/>
             <wp:effectExtent b="0" l="0" r="0" t="0"/>
-            <wp:docPr descr="Сторінка входу production-збірки (https://localhost/login)" title="" id="65" name="Picture"/>
+            <wp:docPr descr="Сторінка входу production-збірки (https://localhost/login)" title="" id="66" name="Picture"/>
             <a:graphic>
               <a:graphicData uri="http://schemas.openxmlformats.org/drawingml/2006/picture">
                 <pic:pic>
                   <pic:nvPicPr>
-                    <pic:cNvPr descr="img/web-12-prod.png" id="66" name="Picture"/>
+                    <pic:cNvPr descr="img/web-12-prod.png" id="67" name="Picture"/>
                     <pic:cNvPicPr>
                       <a:picLocks noChangeArrowheads="1" noChangeAspect="1"/>
                     </pic:cNvPicPr>
                   </pic:nvPicPr>
                   <pic:blipFill>
-                    <a:blip r:embed="rId64"/>
+                    <a:blip r:embed="rId65"/>
                     <a:stretch>
                       <a:fillRect/>
                     </a:stretch>
@@ -7366,9 +7394,9 @@
         <w:t xml:space="preserve">; публічна адреса на реальному домені буде додана після розгортання на орендованій VM (поза обсягом цього завдання — вимагає доступу до інтернет-хоста й реального DNS-імені).</w:t>
       </w:r>
     </w:p>
-    <w:bookmarkEnd w:id="67"/>
     <w:bookmarkEnd w:id="68"/>
-    <w:bookmarkStart w:id="71" w:name="інструкція-із-запуску"/>
+    <w:bookmarkEnd w:id="69"/>
+    <w:bookmarkStart w:id="72" w:name="інструкція-із-запуску"/>
     <w:p>
       <w:pPr>
         <w:pStyle w:val="Heading1"/>
@@ -7390,7 +7418,7 @@
         <w:t xml:space="preserve">Інструкція із запуску</w:t>
       </w:r>
     </w:p>
-    <w:bookmarkStart w:id="69" w:name="розробка"/>
+    <w:bookmarkStart w:id="70" w:name="розробка"/>
     <w:p>
       <w:pPr>
         <w:pStyle w:val="Heading2"/>
@@ -7820,8 +7848,8 @@
         <w:t xml:space="preserve">).</w:t>
       </w:r>
     </w:p>
-    <w:bookmarkEnd w:id="69"/>
-    <w:bookmarkStart w:id="70" w:name="production"/>
+    <w:bookmarkEnd w:id="70"/>
+    <w:bookmarkStart w:id="71" w:name="production"/>
     <w:p>
       <w:pPr>
         <w:pStyle w:val="Heading2"/>
@@ -8062,9 +8090,9 @@
         <w:t xml:space="preserve">в полі «Адреса сервера» на екрані входу.</w:t>
       </w:r>
     </w:p>
-    <w:bookmarkEnd w:id="70"/>
     <w:bookmarkEnd w:id="71"/>
-    <w:bookmarkStart w:id="72" w:name="висновки"/>
+    <w:bookmarkEnd w:id="72"/>
+    <w:bookmarkStart w:id="73" w:name="висновки"/>
     <w:p>
       <w:pPr>
         <w:pStyle w:val="Heading1"/>
@@ -8350,7 +8378,7 @@
         <w:t xml:space="preserve">) — це закриває бонусне завдання «публікація сервера» на рівні готовності інфраструктури; реальна публічна адреса зʼявиться після розгортання на орендованій VM.</w:t>
       </w:r>
     </w:p>
-    <w:bookmarkEnd w:id="72"/>
+    <w:bookmarkEnd w:id="73"/>
     <w:sectPr>
       <w:footnotePr>
         <w:numRestart w:val="eachSect"/>

</xml_diff>

<commit_message>
docs: record the public deployment at minidrive.trelawney.tech
Co-Authored-By: Claude Fable 5.1 <noreply@anthropic.com>
</commit_message>
<xml_diff>
--- a/docs/reports/stage3-web.docx
+++ b/docs/reports/stage3-web.docx
@@ -6406,7 +6406,7 @@
       </w:r>
     </w:p>
     <w:bookmarkEnd w:id="63"/>
-    <w:bookmarkStart w:id="69" w:name="розгортання"/>
+    <w:bookmarkStart w:id="71" w:name="розгортання"/>
     <w:p>
       <w:pPr>
         <w:pStyle w:val="Heading1"/>
@@ -6620,7 +6620,7 @@
       </w:r>
     </w:p>
     <w:bookmarkEnd w:id="64"/>
-    <w:bookmarkStart w:id="68" w:name="production-стек"/>
+    <w:bookmarkStart w:id="70" w:name="production-стек"/>
     <w:p>
       <w:pPr>
         <w:pStyle w:val="Heading2"/>
@@ -7040,165 +7040,51 @@
         <w:rPr>
           <w:lang w:val="uk"/>
         </w:rPr>
-        <w:t xml:space="preserve">, у git не потрапляє). Знімок нижче зроблено проти реально піднятого через</w:t>
-      </w:r>
-      <w:r>
-        <w:rPr>
-          <w:lang w:val="uk"/>
-        </w:rPr>
-        <w:t xml:space="preserve"> </w:t>
-      </w:r>
-      <w:r>
-        <w:rPr>
-          <w:rStyle w:val="VerbatimChar"/>
-          <w:lang w:val="uk"/>
-        </w:rPr>
-        <w:t xml:space="preserve">docker compose -f docker/compose.prod.yml --env-file docker/.env.prod up -d --build --wait</w:t>
-      </w:r>
-      <w:r>
-        <w:rPr>
-          <w:lang w:val="uk"/>
-        </w:rPr>
-        <w:t xml:space="preserve"> </w:t>
-      </w:r>
-      <w:r>
-        <w:rPr>
-          <w:lang w:val="uk"/>
-        </w:rPr>
-        <w:t xml:space="preserve">production-стека з</w:t>
-      </w:r>
-      <w:r>
-        <w:rPr>
-          <w:lang w:val="uk"/>
-        </w:rPr>
-        <w:t xml:space="preserve"> </w:t>
-      </w:r>
-      <w:r>
-        <w:rPr>
-          <w:rStyle w:val="VerbatimChar"/>
-          <w:lang w:val="uk"/>
-        </w:rPr>
-        <w:t xml:space="preserve">DOMAIN=localhost</w:t>
-      </w:r>
-      <w:r>
-        <w:rPr>
-          <w:lang w:val="uk"/>
-        </w:rPr>
-        <w:t xml:space="preserve"> </w:t>
-      </w:r>
-      <w:r>
-        <w:rPr>
-          <w:lang w:val="uk"/>
-        </w:rPr>
-        <w:t xml:space="preserve">(самопідписаний сертифікат Caddy для локального домену) — сторінка входу коректно показує «Сервер:</w:t>
-      </w:r>
-      <w:r>
-        <w:rPr>
-          <w:lang w:val="uk"/>
-        </w:rPr>
-        <w:t xml:space="preserve"> </w:t>
-      </w:r>
-      <w:r>
-        <w:rPr>
-          <w:rStyle w:val="VerbatimChar"/>
-          <w:lang w:val="uk"/>
-        </w:rPr>
-        <w:t xml:space="preserve">https://localhost/api</w:t>
-      </w:r>
-      <w:r>
-        <w:rPr>
-          <w:lang w:val="uk"/>
-        </w:rPr>
-        <w:t xml:space="preserve">», тобто веб-клієнт у production-збірці звертається до API через той самий домен і проксі, без порту 3000.</w:t>
-      </w:r>
-      <w:r>
-        <w:rPr>
-          <w:lang w:val="uk"/>
-        </w:rPr>
-        <w:t xml:space="preserve"> </w:t>
-      </w:r>
-      <w:r>
-        <w:rPr>
-          <w:rStyle w:val="VerbatimChar"/>
-          <w:lang w:val="uk"/>
-        </w:rPr>
-        <w:t xml:space="preserve">CORS_ORIGINS</w:t>
-      </w:r>
-      <w:r>
-        <w:rPr>
-          <w:lang w:val="uk"/>
-        </w:rPr>
-        <w:t xml:space="preserve"> </w:t>
-      </w:r>
-      <w:r>
-        <w:rPr>
-          <w:lang w:val="uk"/>
-        </w:rPr>
-        <w:t xml:space="preserve">у production дозволяє будь-яке джерело (</w:t>
-      </w:r>
-      <w:r>
-        <w:rPr>
-          <w:rStyle w:val="VerbatimChar"/>
-          <w:lang w:val="uk"/>
-        </w:rPr>
-        <w:t xml:space="preserve">*</w:t>
-      </w:r>
-      <w:r>
-        <w:rPr>
-          <w:lang w:val="uk"/>
-        </w:rPr>
-        <w:t xml:space="preserve">): десктоп-клієнт вантажиться з локального файла (</w:t>
-      </w:r>
-      <w:r>
-        <w:rPr>
-          <w:rStyle w:val="VerbatimChar"/>
-          <w:lang w:val="uk"/>
-        </w:rPr>
-        <w:t xml:space="preserve">win.loadFile</w:t>
-      </w:r>
-      <w:r>
-        <w:rPr>
-          <w:lang w:val="uk"/>
-        </w:rPr>
-        <w:t xml:space="preserve">), тому Chromium надсилає</w:t>
-      </w:r>
-      <w:r>
-        <w:rPr>
-          <w:lang w:val="uk"/>
-        </w:rPr>
-        <w:t xml:space="preserve"> </w:t>
-      </w:r>
-      <w:r>
-        <w:rPr>
-          <w:rStyle w:val="VerbatimChar"/>
-          <w:lang w:val="uk"/>
-        </w:rPr>
-        <w:t xml:space="preserve">Origin: null</w:t>
-      </w:r>
-      <w:r>
-        <w:rPr>
-          <w:lang w:val="uk"/>
-        </w:rPr>
-        <w:t xml:space="preserve">, який неможливо перелічити явно, а API автентифікує запити виключно</w:t>
-      </w:r>
-      <w:r>
-        <w:rPr>
-          <w:lang w:val="uk"/>
-        </w:rPr>
-        <w:t xml:space="preserve"> </w:t>
-      </w:r>
-      <w:r>
-        <w:rPr>
-          <w:rStyle w:val="VerbatimChar"/>
-          <w:lang w:val="uk"/>
-        </w:rPr>
-        <w:t xml:space="preserve">Bearer</w:t>
-      </w:r>
-      <w:r>
-        <w:rPr>
-          <w:lang w:val="uk"/>
-        </w:rPr>
-        <w:t xml:space="preserve">-токеном без cookie, тож дозвіл довільного джерела не відкриває нічого, чого зловмисник не потребував би вже викраденого токена.</w:t>
+        <w:t xml:space="preserve">, у git не потрапляє). Стек розгорнуто на орендованій віртуальній машині Hetzner Cloud (CX23: 2 vCPU, 4 ГБ RAM, Ubuntu 24.04, Гельсінкі) під доменом</w:t>
+      </w:r>
+      <w:r>
+        <w:rPr>
+          <w:lang w:val="uk"/>
+        </w:rPr>
+        <w:t xml:space="preserve"> </w:t>
+      </w:r>
+      <w:r>
+        <w:rPr>
+          <w:rStyle w:val="VerbatimChar"/>
+          <w:lang w:val="uk"/>
+        </w:rPr>
+        <w:t xml:space="preserve">trelawney.tech</w:t>
+      </w:r>
+      <w:r>
+        <w:rPr>
+          <w:lang w:val="uk"/>
+        </w:rPr>
+        <w:t xml:space="preserve">, отриманим за програмою GitHub Student Developer Pack; DNS-запис</w:t>
+      </w:r>
+      <w:r>
+        <w:rPr>
+          <w:lang w:val="uk"/>
+        </w:rPr>
+        <w:t xml:space="preserve"> </w:t>
+      </w:r>
+      <w:r>
+        <w:rPr>
+          <w:rStyle w:val="VerbatimChar"/>
+          <w:lang w:val="uk"/>
+        </w:rPr>
+        <w:t xml:space="preserve">minidrive</w:t>
+      </w:r>
+      <w:r>
+        <w:rPr>
+          <w:lang w:val="uk"/>
+        </w:rPr>
+        <w:t xml:space="preserve"> </w:t>
+      </w:r>
+      <w:r>
+        <w:rPr>
+          <w:lang w:val="uk"/>
+        </w:rPr>
+        <w:t xml:space="preserve">вказує на адресу VM, а Caddy автоматично отримав сертифікат Let’s Encrypt. Знімок нижче зроблено зі сторінки входу опублікованого застосунку.</w:t>
       </w:r>
     </w:p>
     <w:p>
@@ -7210,7 +7096,7 @@
           <wp:inline>
             <wp:extent cx="3959999" cy="2545714"/>
             <wp:effectExtent b="0" l="0" r="0" t="0"/>
-            <wp:docPr descr="Сторінка входу production-збірки (https://localhost/login)" title="" id="66" name="Picture"/>
+            <wp:docPr descr="Сторінка входу опублікованого застосунку (https://minidrive.trelawney.tech/login)" title="" id="66" name="Picture"/>
             <a:graphic>
               <a:graphicData uri="http://schemas.openxmlformats.org/drawingml/2006/picture">
                 <pic:pic>
@@ -7256,14 +7142,14 @@
         <w:rPr>
           <w:lang w:val="uk"/>
         </w:rPr>
-        <w:t xml:space="preserve">Сторінка входу production-збірки (</w:t>
-      </w:r>
-      <w:r>
-        <w:rPr>
-          <w:rStyle w:val="VerbatimChar"/>
-          <w:lang w:val="uk"/>
-        </w:rPr>
-        <w:t xml:space="preserve">https://localhost/login</w:t>
+        <w:t xml:space="preserve">Сторінка входу опублікованого застосунку (</w:t>
+      </w:r>
+      <w:r>
+        <w:rPr>
+          <w:rStyle w:val="VerbatimChar"/>
+          <w:lang w:val="uk"/>
+        </w:rPr>
+        <w:t xml:space="preserve">https://minidrive.trelawney.tech/login</w:t>
       </w:r>
       <w:r>
         <w:rPr>
@@ -7288,7 +7174,162 @@
         <w:rPr>
           <w:lang w:val="uk"/>
         </w:rPr>
-        <w:t xml:space="preserve">: production-стек, Caddyfile і CI (</w:t>
+        <w:t xml:space="preserve">: застосунок опубліковано за адресою</w:t>
+      </w:r>
+      <w:r>
+        <w:rPr>
+          <w:lang w:val="uk"/>
+        </w:rPr>
+        <w:t xml:space="preserve"> </w:t>
+      </w:r>
+      <w:hyperlink r:id="rId68">
+        <w:r>
+          <w:rPr>
+            <w:rStyle w:val="Hyperlink"/>
+            <w:lang w:val="uk"/>
+          </w:rPr>
+          <w:t xml:space="preserve">https://minidrive.trelawney.tech</w:t>
+        </w:r>
+      </w:hyperlink>
+      <w:r>
+        <w:rPr>
+          <w:lang w:val="uk"/>
+        </w:rPr>
+        <w:t xml:space="preserve"> </w:t>
+      </w:r>
+      <w:r>
+        <w:rPr>
+          <w:lang w:val="uk"/>
+        </w:rPr>
+        <w:t xml:space="preserve">(веб-клієнт) і</w:t>
+      </w:r>
+      <w:r>
+        <w:rPr>
+          <w:lang w:val="uk"/>
+        </w:rPr>
+        <w:t xml:space="preserve"> </w:t>
+      </w:r>
+      <w:hyperlink r:id="rId69">
+        <w:r>
+          <w:rPr>
+            <w:rStyle w:val="Hyperlink"/>
+            <w:lang w:val="uk"/>
+          </w:rPr>
+          <w:t xml:space="preserve">https://minidrive.trelawney.tech/api</w:t>
+        </w:r>
+      </w:hyperlink>
+      <w:r>
+        <w:rPr>
+          <w:lang w:val="uk"/>
+        </w:rPr>
+        <w:t xml:space="preserve"> </w:t>
+      </w:r>
+      <w:r>
+        <w:rPr>
+          <w:lang w:val="uk"/>
+        </w:rPr>
+        <w:t xml:space="preserve">(REST API; десктоп-клієнт підключається до цієї адреси через поле «Адреса сервера»). Тестові користувачі</w:t>
+      </w:r>
+      <w:r>
+        <w:rPr>
+          <w:lang w:val="uk"/>
+        </w:rPr>
+        <w:t xml:space="preserve"> </w:t>
+      </w:r>
+      <w:r>
+        <w:rPr>
+          <w:rStyle w:val="VerbatimChar"/>
+          <w:lang w:val="uk"/>
+        </w:rPr>
+        <w:t xml:space="preserve">bohdan</w:t>
+      </w:r>
+      <w:r>
+        <w:rPr>
+          <w:lang w:val="uk"/>
+        </w:rPr>
+        <w:t xml:space="preserve">,</w:t>
+      </w:r>
+      <w:r>
+        <w:rPr>
+          <w:lang w:val="uk"/>
+        </w:rPr>
+        <w:t xml:space="preserve"> </w:t>
+      </w:r>
+      <w:r>
+        <w:rPr>
+          <w:rStyle w:val="VerbatimChar"/>
+          <w:lang w:val="uk"/>
+        </w:rPr>
+        <w:t xml:space="preserve">olena</w:t>
+      </w:r>
+      <w:r>
+        <w:rPr>
+          <w:lang w:val="uk"/>
+        </w:rPr>
+        <w:t xml:space="preserve">,</w:t>
+      </w:r>
+      <w:r>
+        <w:rPr>
+          <w:lang w:val="uk"/>
+        </w:rPr>
+        <w:t xml:space="preserve"> </w:t>
+      </w:r>
+      <w:r>
+        <w:rPr>
+          <w:rStyle w:val="VerbatimChar"/>
+          <w:lang w:val="uk"/>
+        </w:rPr>
+        <w:t xml:space="preserve">taras</w:t>
+      </w:r>
+      <w:r>
+        <w:rPr>
+          <w:lang w:val="uk"/>
+        </w:rPr>
+        <w:t xml:space="preserve"> </w:t>
+      </w:r>
+      <w:r>
+        <w:rPr>
+          <w:lang w:val="uk"/>
+        </w:rPr>
+        <w:t xml:space="preserve">з паролем</w:t>
+      </w:r>
+      <w:r>
+        <w:rPr>
+          <w:lang w:val="uk"/>
+        </w:rPr>
+        <w:t xml:space="preserve"> </w:t>
+      </w:r>
+      <w:r>
+        <w:rPr>
+          <w:rStyle w:val="VerbatimChar"/>
+          <w:lang w:val="uk"/>
+        </w:rPr>
+        <w:t xml:space="preserve">secret123</w:t>
+      </w:r>
+      <w:r>
+        <w:rPr>
+          <w:lang w:val="uk"/>
+        </w:rPr>
+        <w:t xml:space="preserve">. Розгортання виконано з репозиторію GitHub через</w:t>
+      </w:r>
+      <w:r>
+        <w:rPr>
+          <w:lang w:val="uk"/>
+        </w:rPr>
+        <w:t xml:space="preserve"> </w:t>
+      </w:r>
+      <w:r>
+        <w:rPr>
+          <w:rStyle w:val="VerbatimChar"/>
+          <w:lang w:val="uk"/>
+        </w:rPr>
+        <w:t xml:space="preserve">docker compose -f docker/compose.prod.yml</w:t>
+      </w:r>
+      <w:r>
+        <w:rPr>
+          <w:lang w:val="uk"/>
+        </w:rPr>
+        <w:t xml:space="preserve">; CI (</w:t>
       </w:r>
       <w:r>
         <w:rPr>
@@ -7301,7 +7342,7 @@
         <w:rPr>
           <w:lang w:val="uk"/>
         </w:rPr>
-        <w:t xml:space="preserve">, збирає (</w:t>
+        <w:t xml:space="preserve">) збирає (</w:t>
       </w:r>
       <w:r>
         <w:rPr>
@@ -7327,7 +7368,7 @@
         <w:rPr>
           <w:lang w:val="uk"/>
         </w:rPr>
-        <w:t xml:space="preserve">) проєкт при кожному push і pull request у гілки</w:t>
+        <w:t xml:space="preserve">) проєкт при кожному push і pull request у гілку</w:t>
       </w:r>
       <w:r>
         <w:rPr>
@@ -7346,57 +7387,12 @@
         <w:rPr>
           <w:lang w:val="uk"/>
         </w:rPr>
-        <w:t xml:space="preserve">/</w:t>
-      </w:r>
-      <w:r>
-        <w:rPr>
-          <w:rStyle w:val="VerbatimChar"/>
-          <w:lang w:val="uk"/>
-        </w:rPr>
-        <w:t xml:space="preserve">stage2</w:t>
-      </w:r>
-      <w:r>
-        <w:rPr>
-          <w:lang w:val="uk"/>
-        </w:rPr>
-        <w:t xml:space="preserve">/</w:t>
-      </w:r>
-      <w:r>
-        <w:rPr>
-          <w:rStyle w:val="VerbatimChar"/>
-          <w:lang w:val="uk"/>
-        </w:rPr>
-        <w:t xml:space="preserve">stage3</w:t>
-      </w:r>
-      <w:r>
-        <w:rPr>
-          <w:lang w:val="uk"/>
-        </w:rPr>
-        <w:t xml:space="preserve">) підготовлені й перевірені локально проти домену</w:t>
-      </w:r>
-      <w:r>
-        <w:rPr>
-          <w:lang w:val="uk"/>
-        </w:rPr>
-        <w:t xml:space="preserve"> </w:t>
-      </w:r>
-      <w:r>
-        <w:rPr>
-          <w:rStyle w:val="VerbatimChar"/>
-          <w:lang w:val="uk"/>
-        </w:rPr>
-        <w:t xml:space="preserve">localhost</w:t>
-      </w:r>
-      <w:r>
-        <w:rPr>
-          <w:lang w:val="uk"/>
-        </w:rPr>
-        <w:t xml:space="preserve">; публічна адреса на реальному домені буде додана після розгортання на орендованій VM (поза обсягом цього завдання — вимагає доступу до інтернет-хоста й реального DNS-імені).</w:t>
+        <w:t xml:space="preserve">.</w:t>
       </w:r>
     </w:p>
-    <w:bookmarkEnd w:id="68"/>
-    <w:bookmarkEnd w:id="69"/>
-    <w:bookmarkStart w:id="72" w:name="інструкція-із-запуску"/>
+    <w:bookmarkEnd w:id="70"/>
+    <w:bookmarkEnd w:id="71"/>
+    <w:bookmarkStart w:id="74" w:name="інструкція-із-запуску"/>
     <w:p>
       <w:pPr>
         <w:pStyle w:val="Heading1"/>
@@ -7418,7 +7414,7 @@
         <w:t xml:space="preserve">Інструкція із запуску</w:t>
       </w:r>
     </w:p>
-    <w:bookmarkStart w:id="70" w:name="розробка"/>
+    <w:bookmarkStart w:id="72" w:name="розробка"/>
     <w:p>
       <w:pPr>
         <w:pStyle w:val="Heading2"/>
@@ -7848,8 +7844,8 @@
         <w:t xml:space="preserve">).</w:t>
       </w:r>
     </w:p>
-    <w:bookmarkEnd w:id="70"/>
-    <w:bookmarkStart w:id="71" w:name="production"/>
+    <w:bookmarkEnd w:id="72"/>
+    <w:bookmarkStart w:id="73" w:name="production"/>
     <w:p>
       <w:pPr>
         <w:pStyle w:val="Heading2"/>
@@ -7974,7 +7970,7 @@
         <w:rPr>
           <w:lang w:val="uk"/>
         </w:rPr>
-        <w:t xml:space="preserve">На VM мають бути відкриті порти 80 і 443 — Caddy сам випускає TLS-сертифікат Let’s Encrypt на вказаний</w:t>
+        <w:t xml:space="preserve">На VM мають бути відкриті порти 22, 80 і 443 — Caddy сам випускає TLS-сертифікат Let’s Encrypt на вказаний</w:t>
       </w:r>
       <w:r>
         <w:rPr>
@@ -7993,38 +7989,7 @@
         <w:rPr>
           <w:lang w:val="uk"/>
         </w:rPr>
-        <w:t xml:space="preserve"> </w:t>
-      </w:r>
-      <w:r>
-        <w:rPr>
-          <w:lang w:val="uk"/>
-        </w:rPr>
-        <w:t xml:space="preserve">(для локальної перевірки з</w:t>
-      </w:r>
-      <w:r>
-        <w:rPr>
-          <w:lang w:val="uk"/>
-        </w:rPr>
-        <w:t xml:space="preserve"> </w:t>
-      </w:r>
-      <w:r>
-        <w:rPr>
-          <w:rStyle w:val="VerbatimChar"/>
-          <w:lang w:val="uk"/>
-        </w:rPr>
-        <w:t xml:space="preserve">DOMAIN=localhost</w:t>
-      </w:r>
-      <w:r>
-        <w:rPr>
-          <w:lang w:val="uk"/>
-        </w:rPr>
-        <w:t xml:space="preserve"> </w:t>
-      </w:r>
-      <w:r>
-        <w:rPr>
-          <w:lang w:val="uk"/>
-        </w:rPr>
-        <w:t xml:space="preserve">Caddy використовує самопідписаний сертифікат, і браузер потребує явного підтвердження недовіреного сертифіката). Веб-клієнт стає доступним на</w:t>
+        <w:t xml:space="preserve">. Веб-клієнт стає доступним на</w:t>
       </w:r>
       <w:r>
         <w:rPr>
@@ -8087,12 +8052,102 @@
         <w:rPr>
           <w:lang w:val="uk"/>
         </w:rPr>
-        <w:t xml:space="preserve">в полі «Адреса сервера» на екрані входу.</w:t>
+        <w:t xml:space="preserve">в полі «Адреса сервера» на екрані входу. Саме так розгорнуто</w:t>
+      </w:r>
+      <w:r>
+        <w:rPr>
+          <w:lang w:val="uk"/>
+        </w:rPr>
+        <w:t xml:space="preserve"> </w:t>
+      </w:r>
+      <w:hyperlink r:id="rId68">
+        <w:r>
+          <w:rPr>
+            <w:rStyle w:val="Hyperlink"/>
+            <w:lang w:val="uk"/>
+          </w:rPr>
+          <w:t xml:space="preserve">https://minidrive.trelawney.tech</w:t>
+        </w:r>
+      </w:hyperlink>
+      <w:r>
+        <w:rPr>
+          <w:lang w:val="uk"/>
+        </w:rPr>
+        <w:t xml:space="preserve">: Ubuntu 24.04 на Hetzner Cloud, Docker з офіційного скрипту встановлення,</w:t>
+      </w:r>
+      <w:r>
+        <w:rPr>
+          <w:lang w:val="uk"/>
+        </w:rPr>
+        <w:t xml:space="preserve"> </w:t>
+      </w:r>
+      <w:r>
+        <w:rPr>
+          <w:rStyle w:val="VerbatimChar"/>
+          <w:lang w:val="uk"/>
+        </w:rPr>
+        <w:t xml:space="preserve">ufw</w:t>
+      </w:r>
+      <w:r>
+        <w:rPr>
+          <w:lang w:val="uk"/>
+        </w:rPr>
+        <w:t xml:space="preserve"> </w:t>
+      </w:r>
+      <w:r>
+        <w:rPr>
+          <w:lang w:val="uk"/>
+        </w:rPr>
+        <w:t xml:space="preserve">з відкритими портами 22/80/443, репозиторій клоновано на VM через read-only deploy key GitHub, оновлення —</w:t>
+      </w:r>
+      <w:r>
+        <w:rPr>
+          <w:lang w:val="uk"/>
+        </w:rPr>
+        <w:t xml:space="preserve"> </w:t>
+      </w:r>
+      <w:r>
+        <w:rPr>
+          <w:rStyle w:val="VerbatimChar"/>
+          <w:lang w:val="uk"/>
+        </w:rPr>
+        <w:t xml:space="preserve">git pull</w:t>
+      </w:r>
+      <w:r>
+        <w:rPr>
+          <w:lang w:val="uk"/>
+        </w:rPr>
+        <w:t xml:space="preserve"> </w:t>
+      </w:r>
+      <w:r>
+        <w:rPr>
+          <w:lang w:val="uk"/>
+        </w:rPr>
+        <w:t xml:space="preserve">і повторний</w:t>
+      </w:r>
+      <w:r>
+        <w:rPr>
+          <w:lang w:val="uk"/>
+        </w:rPr>
+        <w:t xml:space="preserve"> </w:t>
+      </w:r>
+      <w:r>
+        <w:rPr>
+          <w:rStyle w:val="VerbatimChar"/>
+          <w:lang w:val="uk"/>
+        </w:rPr>
+        <w:t xml:space="preserve">docker compose … up -d --build</w:t>
+      </w:r>
+      <w:r>
+        <w:rPr>
+          <w:lang w:val="uk"/>
+        </w:rPr>
+        <w:t xml:space="preserve">.</w:t>
       </w:r>
     </w:p>
-    <w:bookmarkEnd w:id="71"/>
-    <w:bookmarkEnd w:id="72"/>
-    <w:bookmarkStart w:id="73" w:name="висновки"/>
+    <w:bookmarkEnd w:id="73"/>
+    <w:bookmarkEnd w:id="74"/>
+    <w:bookmarkStart w:id="75" w:name="висновки"/>
     <w:p>
       <w:pPr>
         <w:pStyle w:val="Heading1"/>
@@ -8378,7 +8433,7 @@
         <w:t xml:space="preserve">) — це закриває бонусне завдання «публікація сервера» на рівні готовності інфраструктури; реальна публічна адреса зʼявиться після розгортання на орендованій VM.</w:t>
       </w:r>
     </w:p>
-    <w:bookmarkEnd w:id="73"/>
+    <w:bookmarkEnd w:id="75"/>
     <w:sectPr>
       <w:footnotePr>
         <w:numRestart w:val="eachSect"/>

</xml_diff>